<commit_message>
docs: alinear documentacion RE con politicas PSI 2024
</commit_message>
<xml_diff>
--- a/documentacion/word/RecepcionElectronica/API-RE-001-API.docx
+++ b/documentacion/word/RecepcionElectronica/API-RE-001-API.docx
@@ -6,8 +6,10 @@
       <w:pPr>
         <w:pStyle w:val="Heading1"/>
       </w:pPr>
-      <w:r/>
       <w:r>
+        <w:rPr>
+          <w:color w:val="1F4E79"/>
+        </w:rPr>
         <w:t>Documentación de API</w:t>
       </w:r>
     </w:p>
@@ -15,8 +17,10 @@
       <w:pPr>
         <w:pStyle w:val="Heading2"/>
       </w:pPr>
-      <w:r/>
       <w:r>
+        <w:rPr>
+          <w:color w:val="1F4E79"/>
+        </w:rPr>
         <w:t>Recepción Electrónica (RE) — Base</w:t>
       </w:r>
     </w:p>
@@ -44,11 +48,13 @@
             <w:r>
               <w:rPr>
                 <w:b/>
+                <w:color w:val="1F4E79"/>
               </w:rPr>
             </w:r>
             <w:r>
               <w:rPr>
                 <w:b/>
+                <w:color w:val="1F4E79"/>
               </w:rPr>
               <w:t>Campo</w:t>
             </w:r>
@@ -62,11 +68,13 @@
             <w:r>
               <w:rPr>
                 <w:b/>
+                <w:color w:val="1F4E79"/>
               </w:rPr>
             </w:r>
             <w:r>
               <w:rPr>
                 <w:b/>
+                <w:color w:val="1F4E79"/>
               </w:rPr>
               <w:t>Descripción</w:t>
             </w:r>
@@ -268,16 +276,21 @@
     </w:tbl>
     <w:p/>
     <w:p>
+      <w:pPr>
+        <w:ind w:left="360"/>
+      </w:pPr>
       <w:r>
-        <w:t>&gt; Documento de la base. Los endpoints de módulos opcionales (dispositivos, contratistas, capacitaciones, registro de campo, OCR, validación facial) se documentan en sus documentos de integración.</w:t>
+        <w:t>Documento de la base. Los endpoints de módulos opcionales (dispositivos, contratistas, capacitaciones, registro de campo, OCR, validación facial) se documentan en sus documentos de integración.</w:t>
       </w:r>
     </w:p>
     <w:p>
       <w:pPr>
         <w:pStyle w:val="Heading2"/>
       </w:pPr>
-      <w:r/>
       <w:r>
+        <w:rPr>
+          <w:color w:val="1F4E79"/>
+        </w:rPr>
         <w:t>Control de versiones</w:t>
       </w:r>
     </w:p>
@@ -302,11 +315,13 @@
             <w:r>
               <w:rPr>
                 <w:b/>
+                <w:color w:val="1F4E79"/>
               </w:rPr>
             </w:r>
             <w:r>
               <w:rPr>
                 <w:b/>
+                <w:color w:val="1F4E79"/>
               </w:rPr>
               <w:t>Versión</w:t>
             </w:r>
@@ -320,11 +335,13 @@
             <w:r>
               <w:rPr>
                 <w:b/>
+                <w:color w:val="1F4E79"/>
               </w:rPr>
             </w:r>
             <w:r>
               <w:rPr>
                 <w:b/>
+                <w:color w:val="1F4E79"/>
               </w:rPr>
               <w:t>Fecha</w:t>
             </w:r>
@@ -338,11 +355,13 @@
             <w:r>
               <w:rPr>
                 <w:b/>
+                <w:color w:val="1F4E79"/>
               </w:rPr>
             </w:r>
             <w:r>
               <w:rPr>
                 <w:b/>
+                <w:color w:val="1F4E79"/>
               </w:rPr>
               <w:t>Autor</w:t>
             </w:r>
@@ -356,11 +375,13 @@
             <w:r>
               <w:rPr>
                 <w:b/>
+                <w:color w:val="1F4E79"/>
               </w:rPr>
             </w:r>
             <w:r>
               <w:rPr>
                 <w:b/>
+                <w:color w:val="1F4E79"/>
               </w:rPr>
               <w:t>Descripción</w:t>
             </w:r>
@@ -419,8 +440,10 @@
       <w:pPr>
         <w:pStyle w:val="Heading2"/>
       </w:pPr>
-      <w:r/>
       <w:r>
+        <w:rPr>
+          <w:color w:val="1F4E79"/>
+        </w:rPr>
         <w:t>1. Generalidades</w:t>
       </w:r>
     </w:p>
@@ -434,7 +457,6 @@
       <w:r>
         <w:rPr>
           <w:rFonts w:ascii="Consolas" w:hAnsi="Consolas"/>
-          <w:color w:val="C7254E"/>
         </w:rPr>
         <w:t>/api</w:t>
       </w:r>
@@ -452,7 +474,6 @@
       <w:r>
         <w:rPr>
           <w:rFonts w:ascii="Consolas" w:hAnsi="Consolas"/>
-          <w:color w:val="C7254E"/>
         </w:rPr>
         <w:t>x-access-token</w:t>
       </w:r>
@@ -470,7 +491,6 @@
       <w:r>
         <w:rPr>
           <w:rFonts w:ascii="Consolas" w:hAnsi="Consolas"/>
-          <w:color w:val="C7254E"/>
         </w:rPr>
         <w:t>validarTokenYRol([...])</w:t>
       </w:r>
@@ -490,8 +510,10 @@
       <w:pPr>
         <w:pStyle w:val="Heading3"/>
       </w:pPr>
-      <w:r/>
       <w:r>
+        <w:rPr>
+          <w:color w:val="1F4E79"/>
+        </w:rPr>
         <w:t>1.1 Formato de respuesta</w:t>
       </w:r>
     </w:p>
@@ -501,14 +523,10 @@
       </w:r>
     </w:p>
     <w:p>
-      <w:pPr>
-        <w:ind w:left="360"/>
-      </w:pPr>
       <w:r>
         <w:rPr>
           <w:rFonts w:ascii="Consolas" w:hAnsi="Consolas"/>
-          <w:color w:val="2B2B2B"/>
-          <w:sz w:val="19"/>
+          <w:sz w:val="18"/>
         </w:rPr>
         <w:t>{ "estado": true, "datos": {} }</w:t>
       </w:r>
@@ -519,14 +537,10 @@
       </w:r>
     </w:p>
     <w:p>
-      <w:pPr>
-        <w:ind w:left="360"/>
-      </w:pPr>
       <w:r>
         <w:rPr>
           <w:rFonts w:ascii="Consolas" w:hAnsi="Consolas"/>
-          <w:color w:val="2B2B2B"/>
-          <w:sz w:val="19"/>
+          <w:sz w:val="18"/>
         </w:rPr>
         <w:t>{ "estado": false, "mensaje": "Descripción del error" }</w:t>
       </w:r>
@@ -537,14 +551,10 @@
       </w:r>
     </w:p>
     <w:p>
-      <w:pPr>
-        <w:ind w:left="360"/>
-      </w:pPr>
       <w:r>
         <w:rPr>
           <w:rFonts w:ascii="Consolas" w:hAnsi="Consolas"/>
-          <w:color w:val="2B2B2B"/>
-          <w:sz w:val="19"/>
+          <w:sz w:val="18"/>
         </w:rPr>
         <w:t>{ "estado": false, "mensaje": "Revisa que los datos sean correctos", "mensajes": {} }</w:t>
       </w:r>
@@ -553,16 +563,11 @@
       <w:pPr>
         <w:pStyle w:val="Heading2"/>
       </w:pPr>
-      <w:r/>
-      <w:r>
-        <w:t xml:space="preserve">2. Autenticación — </w:t>
-      </w:r>
       <w:r>
         <w:rPr>
-          <w:rFonts w:ascii="Consolas" w:hAnsi="Consolas"/>
-          <w:color w:val="C7254E"/>
+          <w:color w:val="1F4E79"/>
         </w:rPr>
-        <w:t>/api/auth</w:t>
+        <w:t>2. Autenticación — `/api/auth`</w:t>
       </w:r>
     </w:p>
     <w:tbl>
@@ -587,11 +592,13 @@
             <w:r>
               <w:rPr>
                 <w:b/>
+                <w:color w:val="1F4E79"/>
               </w:rPr>
             </w:r>
             <w:r>
               <w:rPr>
                 <w:b/>
+                <w:color w:val="1F4E79"/>
               </w:rPr>
               <w:t>Método</w:t>
             </w:r>
@@ -605,11 +612,13 @@
             <w:r>
               <w:rPr>
                 <w:b/>
+                <w:color w:val="1F4E79"/>
               </w:rPr>
             </w:r>
             <w:r>
               <w:rPr>
                 <w:b/>
+                <w:color w:val="1F4E79"/>
               </w:rPr>
               <w:t>Ruta</w:t>
             </w:r>
@@ -623,11 +632,13 @@
             <w:r>
               <w:rPr>
                 <w:b/>
+                <w:color w:val="1F4E79"/>
               </w:rPr>
             </w:r>
             <w:r>
               <w:rPr>
                 <w:b/>
+                <w:color w:val="1F4E79"/>
               </w:rPr>
               <w:t>Recibe</w:t>
             </w:r>
@@ -641,11 +652,13 @@
             <w:r>
               <w:rPr>
                 <w:b/>
+                <w:color w:val="1F4E79"/>
               </w:rPr>
             </w:r>
             <w:r>
               <w:rPr>
                 <w:b/>
+                <w:color w:val="1F4E79"/>
               </w:rPr>
               <w:t>Responde</w:t>
             </w:r>
@@ -659,11 +672,13 @@
             <w:r>
               <w:rPr>
                 <w:b/>
+                <w:color w:val="1F4E79"/>
               </w:rPr>
             </w:r>
             <w:r>
               <w:rPr>
                 <w:b/>
+                <w:color w:val="1F4E79"/>
               </w:rPr>
               <w:t>Login</w:t>
             </w:r>
@@ -691,7 +706,6 @@
             <w:r>
               <w:rPr>
                 <w:rFonts w:ascii="Consolas" w:hAnsi="Consolas"/>
-                <w:color w:val="C7254E"/>
               </w:rPr>
               <w:t>/api/auth</w:t>
             </w:r>
@@ -752,7 +766,6 @@
             <w:r>
               <w:rPr>
                 <w:rFonts w:ascii="Consolas" w:hAnsi="Consolas"/>
-                <w:color w:val="C7254E"/>
               </w:rPr>
               <w:t>/api/auth/logout</w:t>
             </w:r>
@@ -798,16 +811,11 @@
       <w:pPr>
         <w:pStyle w:val="Heading2"/>
       </w:pPr>
-      <w:r/>
-      <w:r>
-        <w:t xml:space="preserve">3. Recuperación de contraseña — </w:t>
-      </w:r>
       <w:r>
         <w:rPr>
-          <w:rFonts w:ascii="Consolas" w:hAnsi="Consolas"/>
-          <w:color w:val="C7254E"/>
+          <w:color w:val="1F4E79"/>
         </w:rPr>
-        <w:t>/api/recuperaciones</w:t>
+        <w:t>3. Recuperación de contraseña — `/api/recuperaciones`</w:t>
       </w:r>
     </w:p>
     <w:tbl>
@@ -832,11 +840,13 @@
             <w:r>
               <w:rPr>
                 <w:b/>
+                <w:color w:val="1F4E79"/>
               </w:rPr>
             </w:r>
             <w:r>
               <w:rPr>
                 <w:b/>
+                <w:color w:val="1F4E79"/>
               </w:rPr>
               <w:t>Método</w:t>
             </w:r>
@@ -850,11 +860,13 @@
             <w:r>
               <w:rPr>
                 <w:b/>
+                <w:color w:val="1F4E79"/>
               </w:rPr>
             </w:r>
             <w:r>
               <w:rPr>
                 <w:b/>
+                <w:color w:val="1F4E79"/>
               </w:rPr>
               <w:t>Ruta</w:t>
             </w:r>
@@ -868,11 +880,13 @@
             <w:r>
               <w:rPr>
                 <w:b/>
+                <w:color w:val="1F4E79"/>
               </w:rPr>
             </w:r>
             <w:r>
               <w:rPr>
                 <w:b/>
+                <w:color w:val="1F4E79"/>
               </w:rPr>
               <w:t>Recibe</w:t>
             </w:r>
@@ -886,11 +900,13 @@
             <w:r>
               <w:rPr>
                 <w:b/>
+                <w:color w:val="1F4E79"/>
               </w:rPr>
             </w:r>
             <w:r>
               <w:rPr>
                 <w:b/>
+                <w:color w:val="1F4E79"/>
               </w:rPr>
               <w:t>Responde</w:t>
             </w:r>
@@ -904,11 +920,13 @@
             <w:r>
               <w:rPr>
                 <w:b/>
+                <w:color w:val="1F4E79"/>
               </w:rPr>
             </w:r>
             <w:r>
               <w:rPr>
                 <w:b/>
+                <w:color w:val="1F4E79"/>
               </w:rPr>
               <w:t>Login</w:t>
             </w:r>
@@ -936,7 +954,6 @@
             <w:r>
               <w:rPr>
                 <w:rFonts w:ascii="Consolas" w:hAnsi="Consolas"/>
-                <w:color w:val="C7254E"/>
               </w:rPr>
               <w:t>/enviar-codigo</w:t>
             </w:r>
@@ -997,7 +1014,6 @@
             <w:r>
               <w:rPr>
                 <w:rFonts w:ascii="Consolas" w:hAnsi="Consolas"/>
-                <w:color w:val="C7254E"/>
               </w:rPr>
               <w:t>/validar-codigo</w:t>
             </w:r>
@@ -1058,7 +1074,6 @@
             <w:r>
               <w:rPr>
                 <w:rFonts w:ascii="Consolas" w:hAnsi="Consolas"/>
-                <w:color w:val="C7254E"/>
               </w:rPr>
               <w:t>/modificar-contrasena</w:t>
             </w:r>
@@ -1104,16 +1119,11 @@
       <w:pPr>
         <w:pStyle w:val="Heading2"/>
       </w:pPr>
-      <w:r/>
-      <w:r>
-        <w:t xml:space="preserve">4. Validación / setup inicial — </w:t>
-      </w:r>
       <w:r>
         <w:rPr>
-          <w:rFonts w:ascii="Consolas" w:hAnsi="Consolas"/>
-          <w:color w:val="C7254E"/>
+          <w:color w:val="1F4E79"/>
         </w:rPr>
-        <w:t>/api/validacion</w:t>
+        <w:t>4. Validación / setup inicial — `/api/validacion`</w:t>
       </w:r>
     </w:p>
     <w:tbl>
@@ -1137,11 +1147,13 @@
             <w:r>
               <w:rPr>
                 <w:b/>
+                <w:color w:val="1F4E79"/>
               </w:rPr>
             </w:r>
             <w:r>
               <w:rPr>
                 <w:b/>
+                <w:color w:val="1F4E79"/>
               </w:rPr>
               <w:t>Método</w:t>
             </w:r>
@@ -1155,11 +1167,13 @@
             <w:r>
               <w:rPr>
                 <w:b/>
+                <w:color w:val="1F4E79"/>
               </w:rPr>
             </w:r>
             <w:r>
               <w:rPr>
                 <w:b/>
+                <w:color w:val="1F4E79"/>
               </w:rPr>
               <w:t>Ruta</w:t>
             </w:r>
@@ -1173,11 +1187,13 @@
             <w:r>
               <w:rPr>
                 <w:b/>
+                <w:color w:val="1F4E79"/>
               </w:rPr>
             </w:r>
             <w:r>
               <w:rPr>
                 <w:b/>
+                <w:color w:val="1F4E79"/>
               </w:rPr>
               <w:t>Propósito</w:t>
             </w:r>
@@ -1191,11 +1207,13 @@
             <w:r>
               <w:rPr>
                 <w:b/>
+                <w:color w:val="1F4E79"/>
               </w:rPr>
             </w:r>
             <w:r>
               <w:rPr>
                 <w:b/>
+                <w:color w:val="1F4E79"/>
               </w:rPr>
               <w:t>Login</w:t>
             </w:r>
@@ -1223,7 +1241,6 @@
             <w:r>
               <w:rPr>
                 <w:rFonts w:ascii="Consolas" w:hAnsi="Consolas"/>
-                <w:color w:val="C7254E"/>
               </w:rPr>
               <w:t>/app</w:t>
             </w:r>
@@ -1273,7 +1290,6 @@
             <w:r>
               <w:rPr>
                 <w:rFonts w:ascii="Consolas" w:hAnsi="Consolas"/>
-                <w:color w:val="C7254E"/>
               </w:rPr>
               <w:t>/session-config</w:t>
             </w:r>
@@ -1323,7 +1339,6 @@
             <w:r>
               <w:rPr>
                 <w:rFonts w:ascii="Consolas" w:hAnsi="Consolas"/>
-                <w:color w:val="C7254E"/>
               </w:rPr>
               <w:t>/generales</w:t>
             </w:r>
@@ -1333,7 +1348,6 @@
             <w:r>
               <w:rPr>
                 <w:rFonts w:ascii="Consolas" w:hAnsi="Consolas"/>
-                <w:color w:val="C7254E"/>
               </w:rPr>
               <w:t>/accesos</w:t>
             </w:r>
@@ -1343,7 +1357,6 @@
             <w:r>
               <w:rPr>
                 <w:rFonts w:ascii="Consolas" w:hAnsi="Consolas"/>
-                <w:color w:val="C7254E"/>
               </w:rPr>
               <w:t>/pisos</w:t>
             </w:r>
@@ -1393,7 +1406,6 @@
             <w:r>
               <w:rPr>
                 <w:rFonts w:ascii="Consolas" w:hAnsi="Consolas"/>
-                <w:color w:val="C7254E"/>
               </w:rPr>
               <w:t>/usuario/form-nuevo</w:t>
             </w:r>
@@ -1403,7 +1415,6 @@
             <w:r>
               <w:rPr>
                 <w:rFonts w:ascii="Consolas" w:hAnsi="Consolas"/>
-                <w:color w:val="C7254E"/>
               </w:rPr>
               <w:t>/empresa/form-nuevo</w:t>
             </w:r>
@@ -1453,7 +1464,6 @@
             <w:r>
               <w:rPr>
                 <w:rFonts w:ascii="Consolas" w:hAnsi="Consolas"/>
-                <w:color w:val="C7254E"/>
               </w:rPr>
               <w:t>/empresa</w:t>
             </w:r>
@@ -1463,7 +1473,6 @@
             <w:r>
               <w:rPr>
                 <w:rFonts w:ascii="Consolas" w:hAnsi="Consolas"/>
-                <w:color w:val="C7254E"/>
               </w:rPr>
               <w:t>/piso</w:t>
             </w:r>
@@ -1473,7 +1482,6 @@
             <w:r>
               <w:rPr>
                 <w:rFonts w:ascii="Consolas" w:hAnsi="Consolas"/>
-                <w:color w:val="C7254E"/>
               </w:rPr>
               <w:t>/acceso</w:t>
             </w:r>
@@ -1483,7 +1491,6 @@
             <w:r>
               <w:rPr>
                 <w:rFonts w:ascii="Consolas" w:hAnsi="Consolas"/>
-                <w:color w:val="C7254E"/>
               </w:rPr>
               <w:t>/usuario</w:t>
             </w:r>
@@ -1493,7 +1500,6 @@
             <w:r>
               <w:rPr>
                 <w:rFonts w:ascii="Consolas" w:hAnsi="Consolas"/>
-                <w:color w:val="C7254E"/>
               </w:rPr>
               <w:t>/configuracion</w:t>
             </w:r>
@@ -1543,7 +1549,6 @@
             <w:r>
               <w:rPr>
                 <w:rFonts w:ascii="Consolas" w:hAnsi="Consolas"/>
-                <w:color w:val="C7254E"/>
               </w:rPr>
               <w:t>/piso/:id</w:t>
             </w:r>
@@ -1553,7 +1558,6 @@
             <w:r>
               <w:rPr>
                 <w:rFonts w:ascii="Consolas" w:hAnsi="Consolas"/>
-                <w:color w:val="C7254E"/>
               </w:rPr>
               <w:t>/acceso/:id</w:t>
             </w:r>
@@ -1588,16 +1592,11 @@
       <w:pPr>
         <w:pStyle w:val="Heading2"/>
       </w:pPr>
-      <w:r/>
-      <w:r>
-        <w:t xml:space="preserve">5. Usuarios — </w:t>
-      </w:r>
       <w:r>
         <w:rPr>
-          <w:rFonts w:ascii="Consolas" w:hAnsi="Consolas"/>
-          <w:color w:val="C7254E"/>
+          <w:color w:val="1F4E79"/>
         </w:rPr>
-        <w:t>/api/usuarios</w:t>
+        <w:t>5. Usuarios — `/api/usuarios`</w:t>
       </w:r>
     </w:p>
     <w:tbl>
@@ -1621,11 +1620,13 @@
             <w:r>
               <w:rPr>
                 <w:b/>
+                <w:color w:val="1F4E79"/>
               </w:rPr>
             </w:r>
             <w:r>
               <w:rPr>
                 <w:b/>
+                <w:color w:val="1F4E79"/>
               </w:rPr>
               <w:t>Método</w:t>
             </w:r>
@@ -1639,11 +1640,13 @@
             <w:r>
               <w:rPr>
                 <w:b/>
+                <w:color w:val="1F4E79"/>
               </w:rPr>
             </w:r>
             <w:r>
               <w:rPr>
                 <w:b/>
+                <w:color w:val="1F4E79"/>
               </w:rPr>
               <w:t>Ruta</w:t>
             </w:r>
@@ -1657,11 +1660,13 @@
             <w:r>
               <w:rPr>
                 <w:b/>
+                <w:color w:val="1F4E79"/>
               </w:rPr>
             </w:r>
             <w:r>
               <w:rPr>
                 <w:b/>
+                <w:color w:val="1F4E79"/>
               </w:rPr>
               <w:t>Propósito</w:t>
             </w:r>
@@ -1675,11 +1680,13 @@
             <w:r>
               <w:rPr>
                 <w:b/>
+                <w:color w:val="1F4E79"/>
               </w:rPr>
             </w:r>
             <w:r>
               <w:rPr>
                 <w:b/>
+                <w:color w:val="1F4E79"/>
               </w:rPr>
               <w:t>Rol</w:t>
             </w:r>
@@ -1707,7 +1714,6 @@
             <w:r>
               <w:rPr>
                 <w:rFonts w:ascii="Consolas" w:hAnsi="Consolas"/>
-                <w:color w:val="C7254E"/>
               </w:rPr>
               <w:t>/</w:t>
             </w:r>
@@ -1717,7 +1723,6 @@
             <w:r>
               <w:rPr>
                 <w:rFonts w:ascii="Consolas" w:hAnsi="Consolas"/>
-                <w:color w:val="C7254E"/>
               </w:rPr>
               <w:t>/activos</w:t>
             </w:r>
@@ -1727,7 +1732,6 @@
             <w:r>
               <w:rPr>
                 <w:rFonts w:ascii="Consolas" w:hAnsi="Consolas"/>
-                <w:color w:val="C7254E"/>
               </w:rPr>
               <w:t>/:id</w:t>
             </w:r>
@@ -1777,7 +1781,6 @@
             <w:r>
               <w:rPr>
                 <w:rFonts w:ascii="Consolas" w:hAnsi="Consolas"/>
-                <w:color w:val="C7254E"/>
               </w:rPr>
               <w:t>/directorio</w:t>
             </w:r>
@@ -1827,7 +1830,6 @@
             <w:r>
               <w:rPr>
                 <w:rFonts w:ascii="Consolas" w:hAnsi="Consolas"/>
-                <w:color w:val="C7254E"/>
               </w:rPr>
               <w:t>/anfitriones</w:t>
             </w:r>
@@ -1877,7 +1879,6 @@
             <w:r>
               <w:rPr>
                 <w:rFonts w:ascii="Consolas" w:hAnsi="Consolas"/>
-                <w:color w:val="C7254E"/>
               </w:rPr>
               <w:t>/descargar-formato</w:t>
             </w:r>
@@ -1887,7 +1888,6 @@
             <w:r>
               <w:rPr>
                 <w:rFonts w:ascii="Consolas" w:hAnsi="Consolas"/>
-                <w:color w:val="C7254E"/>
               </w:rPr>
               <w:t>/form-nuevo</w:t>
             </w:r>
@@ -1897,7 +1897,6 @@
             <w:r>
               <w:rPr>
                 <w:rFonts w:ascii="Consolas" w:hAnsi="Consolas"/>
-                <w:color w:val="C7254E"/>
               </w:rPr>
               <w:t>/form-editar/:id</w:t>
             </w:r>
@@ -1907,7 +1906,6 @@
             <w:r>
               <w:rPr>
                 <w:rFonts w:ascii="Consolas" w:hAnsi="Consolas"/>
-                <w:color w:val="C7254E"/>
               </w:rPr>
               <w:t>/qr/:id</w:t>
             </w:r>
@@ -1957,7 +1955,6 @@
             <w:r>
               <w:rPr>
                 <w:rFonts w:ascii="Consolas" w:hAnsi="Consolas"/>
-                <w:color w:val="C7254E"/>
               </w:rPr>
               <w:t>/</w:t>
             </w:r>
@@ -2007,7 +2004,6 @@
             <w:r>
               <w:rPr>
                 <w:rFonts w:ascii="Consolas" w:hAnsi="Consolas"/>
-                <w:color w:val="C7254E"/>
               </w:rPr>
               <w:t>/cargar-formato</w:t>
             </w:r>
@@ -2017,7 +2013,6 @@
             <w:r>
               <w:rPr>
                 <w:rFonts w:ascii="Consolas" w:hAnsi="Consolas"/>
-                <w:color w:val="C7254E"/>
               </w:rPr>
               <w:t>/programacion</w:t>
             </w:r>
@@ -2067,7 +2062,6 @@
             <w:r>
               <w:rPr>
                 <w:rFonts w:ascii="Consolas" w:hAnsi="Consolas"/>
-                <w:color w:val="C7254E"/>
               </w:rPr>
               <w:t>/:id</w:t>
             </w:r>
@@ -2117,7 +2111,6 @@
             <w:r>
               <w:rPr>
                 <w:rFonts w:ascii="Consolas" w:hAnsi="Consolas"/>
-                <w:color w:val="C7254E"/>
               </w:rPr>
               <w:t>/anonimizar/:id</w:t>
             </w:r>
@@ -2127,7 +2120,6 @@
             <w:r>
               <w:rPr>
                 <w:rFonts w:ascii="Consolas" w:hAnsi="Consolas"/>
-                <w:color w:val="C7254E"/>
               </w:rPr>
               <w:t>/reenviar/:id</w:t>
             </w:r>
@@ -2137,7 +2129,6 @@
             <w:r>
               <w:rPr>
                 <w:rFonts w:ascii="Consolas" w:hAnsi="Consolas"/>
-                <w:color w:val="C7254E"/>
               </w:rPr>
               <w:t>/desbloquear/:id</w:t>
             </w:r>
@@ -2147,7 +2138,6 @@
             <w:r>
               <w:rPr>
                 <w:rFonts w:ascii="Consolas" w:hAnsi="Consolas"/>
-                <w:color w:val="C7254E"/>
               </w:rPr>
               <w:t>/eliminar-permanente/:id</w:t>
             </w:r>
@@ -2157,7 +2147,6 @@
             <w:r>
               <w:rPr>
                 <w:rFonts w:ascii="Consolas" w:hAnsi="Consolas"/>
-                <w:color w:val="C7254E"/>
               </w:rPr>
               <w:t>/:id</w:t>
             </w:r>
@@ -2192,16 +2181,11 @@
       <w:pPr>
         <w:pStyle w:val="Heading2"/>
       </w:pPr>
-      <w:r/>
-      <w:r>
-        <w:t xml:space="preserve">6. Empleados — </w:t>
-      </w:r>
       <w:r>
         <w:rPr>
-          <w:rFonts w:ascii="Consolas" w:hAnsi="Consolas"/>
-          <w:color w:val="C7254E"/>
+          <w:color w:val="1F4E79"/>
         </w:rPr>
-        <w:t>/api/empleados</w:t>
+        <w:t>6. Empleados — `/api/empleados`</w:t>
       </w:r>
     </w:p>
     <w:tbl>
@@ -2225,11 +2209,13 @@
             <w:r>
               <w:rPr>
                 <w:b/>
+                <w:color w:val="1F4E79"/>
               </w:rPr>
             </w:r>
             <w:r>
               <w:rPr>
                 <w:b/>
+                <w:color w:val="1F4E79"/>
               </w:rPr>
               <w:t>Método</w:t>
             </w:r>
@@ -2243,11 +2229,13 @@
             <w:r>
               <w:rPr>
                 <w:b/>
+                <w:color w:val="1F4E79"/>
               </w:rPr>
             </w:r>
             <w:r>
               <w:rPr>
                 <w:b/>
+                <w:color w:val="1F4E79"/>
               </w:rPr>
               <w:t>Ruta</w:t>
             </w:r>
@@ -2261,11 +2249,13 @@
             <w:r>
               <w:rPr>
                 <w:b/>
+                <w:color w:val="1F4E79"/>
               </w:rPr>
             </w:r>
             <w:r>
               <w:rPr>
                 <w:b/>
+                <w:color w:val="1F4E79"/>
               </w:rPr>
               <w:t>Propósito</w:t>
             </w:r>
@@ -2279,11 +2269,13 @@
             <w:r>
               <w:rPr>
                 <w:b/>
+                <w:color w:val="1F4E79"/>
               </w:rPr>
             </w:r>
             <w:r>
               <w:rPr>
                 <w:b/>
+                <w:color w:val="1F4E79"/>
               </w:rPr>
               <w:t>Rol</w:t>
             </w:r>
@@ -2311,7 +2303,6 @@
             <w:r>
               <w:rPr>
                 <w:rFonts w:ascii="Consolas" w:hAnsi="Consolas"/>
-                <w:color w:val="C7254E"/>
               </w:rPr>
               <w:t>/</w:t>
             </w:r>
@@ -2321,7 +2312,6 @@
             <w:r>
               <w:rPr>
                 <w:rFonts w:ascii="Consolas" w:hAnsi="Consolas"/>
-                <w:color w:val="C7254E"/>
               </w:rPr>
               <w:t>/activos</w:t>
             </w:r>
@@ -2331,7 +2321,6 @@
             <w:r>
               <w:rPr>
                 <w:rFonts w:ascii="Consolas" w:hAnsi="Consolas"/>
-                <w:color w:val="C7254E"/>
               </w:rPr>
               <w:t>/:id</w:t>
             </w:r>
@@ -2381,7 +2370,6 @@
             <w:r>
               <w:rPr>
                 <w:rFonts w:ascii="Consolas" w:hAnsi="Consolas"/>
-                <w:color w:val="C7254E"/>
               </w:rPr>
               <w:t>/directorio</w:t>
             </w:r>
@@ -2391,7 +2379,6 @@
             <w:r>
               <w:rPr>
                 <w:rFonts w:ascii="Consolas" w:hAnsi="Consolas"/>
-                <w:color w:val="C7254E"/>
               </w:rPr>
               <w:t>/anfitriones</w:t>
             </w:r>
@@ -2441,7 +2428,6 @@
             <w:r>
               <w:rPr>
                 <w:rFonts w:ascii="Consolas" w:hAnsi="Consolas"/>
-                <w:color w:val="C7254E"/>
               </w:rPr>
               <w:t>/descargar-formato</w:t>
             </w:r>
@@ -2451,7 +2437,6 @@
             <w:r>
               <w:rPr>
                 <w:rFonts w:ascii="Consolas" w:hAnsi="Consolas"/>
-                <w:color w:val="C7254E"/>
               </w:rPr>
               <w:t>/form-nuevo</w:t>
             </w:r>
@@ -2461,7 +2446,6 @@
             <w:r>
               <w:rPr>
                 <w:rFonts w:ascii="Consolas" w:hAnsi="Consolas"/>
-                <w:color w:val="C7254E"/>
               </w:rPr>
               <w:t>/form-editar/:id</w:t>
             </w:r>
@@ -2471,7 +2455,6 @@
             <w:r>
               <w:rPr>
                 <w:rFonts w:ascii="Consolas" w:hAnsi="Consolas"/>
-                <w:color w:val="C7254E"/>
               </w:rPr>
               <w:t>/qr/:id</w:t>
             </w:r>
@@ -2521,7 +2504,6 @@
             <w:r>
               <w:rPr>
                 <w:rFonts w:ascii="Consolas" w:hAnsi="Consolas"/>
-                <w:color w:val="C7254E"/>
               </w:rPr>
               <w:t>/</w:t>
             </w:r>
@@ -2571,7 +2553,6 @@
             <w:r>
               <w:rPr>
                 <w:rFonts w:ascii="Consolas" w:hAnsi="Consolas"/>
-                <w:color w:val="C7254E"/>
               </w:rPr>
               <w:t>/cargar-formato</w:t>
             </w:r>
@@ -2581,7 +2562,6 @@
             <w:r>
               <w:rPr>
                 <w:rFonts w:ascii="Consolas" w:hAnsi="Consolas"/>
-                <w:color w:val="C7254E"/>
               </w:rPr>
               <w:t>/programacion</w:t>
             </w:r>
@@ -2631,7 +2611,6 @@
             <w:r>
               <w:rPr>
                 <w:rFonts w:ascii="Consolas" w:hAnsi="Consolas"/>
-                <w:color w:val="C7254E"/>
               </w:rPr>
               <w:t>/:id</w:t>
             </w:r>
@@ -2681,7 +2660,6 @@
             <w:r>
               <w:rPr>
                 <w:rFonts w:ascii="Consolas" w:hAnsi="Consolas"/>
-                <w:color w:val="C7254E"/>
               </w:rPr>
               <w:t>/anonimizar/:id</w:t>
             </w:r>
@@ -2691,7 +2669,6 @@
             <w:r>
               <w:rPr>
                 <w:rFonts w:ascii="Consolas" w:hAnsi="Consolas"/>
-                <w:color w:val="C7254E"/>
               </w:rPr>
               <w:t>/desbloquear/:id</w:t>
             </w:r>
@@ -2701,7 +2678,6 @@
             <w:r>
               <w:rPr>
                 <w:rFonts w:ascii="Consolas" w:hAnsi="Consolas"/>
-                <w:color w:val="C7254E"/>
               </w:rPr>
               <w:t>/eliminar-permanente/:id</w:t>
             </w:r>
@@ -2711,7 +2687,6 @@
             <w:r>
               <w:rPr>
                 <w:rFonts w:ascii="Consolas" w:hAnsi="Consolas"/>
-                <w:color w:val="C7254E"/>
               </w:rPr>
               <w:t>/:id</w:t>
             </w:r>
@@ -2746,16 +2721,11 @@
       <w:pPr>
         <w:pStyle w:val="Heading2"/>
       </w:pPr>
-      <w:r/>
-      <w:r>
-        <w:t xml:space="preserve">7. Visitantes — </w:t>
-      </w:r>
       <w:r>
         <w:rPr>
-          <w:rFonts w:ascii="Consolas" w:hAnsi="Consolas"/>
-          <w:color w:val="C7254E"/>
+          <w:color w:val="1F4E79"/>
         </w:rPr>
-        <w:t>/api/visitantes</w:t>
+        <w:t>7. Visitantes — `/api/visitantes`</w:t>
       </w:r>
     </w:p>
     <w:tbl>
@@ -2779,11 +2749,13 @@
             <w:r>
               <w:rPr>
                 <w:b/>
+                <w:color w:val="1F4E79"/>
               </w:rPr>
             </w:r>
             <w:r>
               <w:rPr>
                 <w:b/>
+                <w:color w:val="1F4E79"/>
               </w:rPr>
               <w:t>Método</w:t>
             </w:r>
@@ -2797,11 +2769,13 @@
             <w:r>
               <w:rPr>
                 <w:b/>
+                <w:color w:val="1F4E79"/>
               </w:rPr>
             </w:r>
             <w:r>
               <w:rPr>
                 <w:b/>
+                <w:color w:val="1F4E79"/>
               </w:rPr>
               <w:t>Ruta</w:t>
             </w:r>
@@ -2815,11 +2789,13 @@
             <w:r>
               <w:rPr>
                 <w:b/>
+                <w:color w:val="1F4E79"/>
               </w:rPr>
             </w:r>
             <w:r>
               <w:rPr>
                 <w:b/>
+                <w:color w:val="1F4E79"/>
               </w:rPr>
               <w:t>Propósito</w:t>
             </w:r>
@@ -2833,11 +2809,13 @@
             <w:r>
               <w:rPr>
                 <w:b/>
+                <w:color w:val="1F4E79"/>
               </w:rPr>
             </w:r>
             <w:r>
               <w:rPr>
                 <w:b/>
+                <w:color w:val="1F4E79"/>
               </w:rPr>
               <w:t>Rol</w:t>
             </w:r>
@@ -2865,7 +2843,6 @@
             <w:r>
               <w:rPr>
                 <w:rFonts w:ascii="Consolas" w:hAnsi="Consolas"/>
-                <w:color w:val="C7254E"/>
               </w:rPr>
               <w:t>/</w:t>
             </w:r>
@@ -2875,7 +2852,6 @@
             <w:r>
               <w:rPr>
                 <w:rFonts w:ascii="Consolas" w:hAnsi="Consolas"/>
-                <w:color w:val="C7254E"/>
               </w:rPr>
               <w:t>/todos</w:t>
             </w:r>
@@ -2885,7 +2861,6 @@
             <w:r>
               <w:rPr>
                 <w:rFonts w:ascii="Consolas" w:hAnsi="Consolas"/>
-                <w:color w:val="C7254E"/>
               </w:rPr>
               <w:t>/activos</w:t>
             </w:r>
@@ -2895,7 +2870,6 @@
             <w:r>
               <w:rPr>
                 <w:rFonts w:ascii="Consolas" w:hAnsi="Consolas"/>
-                <w:color w:val="C7254E"/>
               </w:rPr>
               <w:t>/:id</w:t>
             </w:r>
@@ -2945,7 +2919,6 @@
             <w:r>
               <w:rPr>
                 <w:rFonts w:ascii="Consolas" w:hAnsi="Consolas"/>
-                <w:color w:val="C7254E"/>
               </w:rPr>
               <w:t>/descargar-formato</w:t>
             </w:r>
@@ -2955,7 +2928,6 @@
             <w:r>
               <w:rPr>
                 <w:rFonts w:ascii="Consolas" w:hAnsi="Consolas"/>
-                <w:color w:val="C7254E"/>
               </w:rPr>
               <w:t>/form-editar/:id</w:t>
             </w:r>
@@ -3005,7 +2977,6 @@
             <w:r>
               <w:rPr>
                 <w:rFonts w:ascii="Consolas" w:hAnsi="Consolas"/>
-                <w:color w:val="C7254E"/>
               </w:rPr>
               <w:t>/qr/:id</w:t>
             </w:r>
@@ -3015,7 +2986,6 @@
             <w:r>
               <w:rPr>
                 <w:rFonts w:ascii="Consolas" w:hAnsi="Consolas"/>
-                <w:color w:val="C7254E"/>
               </w:rPr>
               <w:t>/qr/</w:t>
             </w:r>
@@ -3065,7 +3035,6 @@
             <w:r>
               <w:rPr>
                 <w:rFonts w:ascii="Consolas" w:hAnsi="Consolas"/>
-                <w:color w:val="C7254E"/>
               </w:rPr>
               <w:t>/</w:t>
             </w:r>
@@ -3115,7 +3084,6 @@
             <w:r>
               <w:rPr>
                 <w:rFonts w:ascii="Consolas" w:hAnsi="Consolas"/>
-                <w:color w:val="C7254E"/>
               </w:rPr>
               <w:t>/cargar-formato</w:t>
             </w:r>
@@ -3165,7 +3133,6 @@
             <w:r>
               <w:rPr>
                 <w:rFonts w:ascii="Consolas" w:hAnsi="Consolas"/>
-                <w:color w:val="C7254E"/>
               </w:rPr>
               <w:t>/:id</w:t>
             </w:r>
@@ -3215,7 +3182,6 @@
             <w:r>
               <w:rPr>
                 <w:rFonts w:ascii="Consolas" w:hAnsi="Consolas"/>
-                <w:color w:val="C7254E"/>
               </w:rPr>
               <w:t>/eliminar-permanente/:id</w:t>
             </w:r>
@@ -3225,7 +3191,6 @@
             <w:r>
               <w:rPr>
                 <w:rFonts w:ascii="Consolas" w:hAnsi="Consolas"/>
-                <w:color w:val="C7254E"/>
               </w:rPr>
               <w:t>/:id</w:t>
             </w:r>
@@ -3257,8 +3222,11 @@
     </w:tbl>
     <w:p/>
     <w:p>
+      <w:pPr>
+        <w:ind w:left="360"/>
+      </w:pPr>
       <w:r>
-        <w:t xml:space="preserve">&gt; Operaciones avanzadas de visitantes (autorización QR, programación, verificación, bloqueo/desbloqueo, resync, reversión) se documentan en el módulo </w:t>
+        <w:t xml:space="preserve">Operaciones avanzadas de visitantes (autorización QR, programación, verificación, bloqueo/desbloqueo, resync, reversión) se documentan en el módulo </w:t>
       </w:r>
       <w:r>
         <w:rPr>
@@ -3274,16 +3242,11 @@
       <w:pPr>
         <w:pStyle w:val="Heading2"/>
       </w:pPr>
-      <w:r/>
-      <w:r>
-        <w:t xml:space="preserve">8. Registros / visitas — </w:t>
-      </w:r>
       <w:r>
         <w:rPr>
-          <w:rFonts w:ascii="Consolas" w:hAnsi="Consolas"/>
-          <w:color w:val="C7254E"/>
+          <w:color w:val="1F4E79"/>
         </w:rPr>
-        <w:t>/api/registros</w:t>
+        <w:t>8. Registros / visitas — `/api/registros`</w:t>
       </w:r>
     </w:p>
     <w:tbl>
@@ -3307,11 +3270,13 @@
             <w:r>
               <w:rPr>
                 <w:b/>
+                <w:color w:val="1F4E79"/>
               </w:rPr>
             </w:r>
             <w:r>
               <w:rPr>
                 <w:b/>
+                <w:color w:val="1F4E79"/>
               </w:rPr>
               <w:t>Método</w:t>
             </w:r>
@@ -3325,11 +3290,13 @@
             <w:r>
               <w:rPr>
                 <w:b/>
+                <w:color w:val="1F4E79"/>
               </w:rPr>
             </w:r>
             <w:r>
               <w:rPr>
                 <w:b/>
+                <w:color w:val="1F4E79"/>
               </w:rPr>
               <w:t>Ruta</w:t>
             </w:r>
@@ -3343,11 +3310,13 @@
             <w:r>
               <w:rPr>
                 <w:b/>
+                <w:color w:val="1F4E79"/>
               </w:rPr>
             </w:r>
             <w:r>
               <w:rPr>
                 <w:b/>
+                <w:color w:val="1F4E79"/>
               </w:rPr>
               <w:t>Propósito</w:t>
             </w:r>
@@ -3361,11 +3330,13 @@
             <w:r>
               <w:rPr>
                 <w:b/>
+                <w:color w:val="1F4E79"/>
               </w:rPr>
             </w:r>
             <w:r>
               <w:rPr>
                 <w:b/>
+                <w:color w:val="1F4E79"/>
               </w:rPr>
               <w:t>Rol/Login</w:t>
             </w:r>
@@ -3393,7 +3364,6 @@
             <w:r>
               <w:rPr>
                 <w:rFonts w:ascii="Consolas" w:hAnsi="Consolas"/>
-                <w:color w:val="C7254E"/>
               </w:rPr>
               <w:t>/</w:t>
             </w:r>
@@ -3403,7 +3373,6 @@
             <w:r>
               <w:rPr>
                 <w:rFonts w:ascii="Consolas" w:hAnsi="Consolas"/>
-                <w:color w:val="C7254E"/>
               </w:rPr>
               <w:t>/:id</w:t>
             </w:r>
@@ -3453,7 +3422,6 @@
             <w:r>
               <w:rPr>
                 <w:rFonts w:ascii="Consolas" w:hAnsi="Consolas"/>
-                <w:color w:val="C7254E"/>
               </w:rPr>
               <w:t>/ultimo-registro</w:t>
             </w:r>
@@ -3463,7 +3431,6 @@
             <w:r>
               <w:rPr>
                 <w:rFonts w:ascii="Consolas" w:hAnsi="Consolas"/>
-                <w:color w:val="C7254E"/>
               </w:rPr>
               <w:t>/form-nuevo</w:t>
             </w:r>
@@ -3473,7 +3440,6 @@
             <w:r>
               <w:rPr>
                 <w:rFonts w:ascii="Consolas" w:hAnsi="Consolas"/>
-                <w:color w:val="C7254E"/>
               </w:rPr>
               <w:t>/form-editar/:id</w:t>
             </w:r>
@@ -3523,7 +3489,6 @@
             <w:r>
               <w:rPr>
                 <w:rFonts w:ascii="Consolas" w:hAnsi="Consolas"/>
-                <w:color w:val="C7254E"/>
               </w:rPr>
               <w:t>/</w:t>
             </w:r>
@@ -3573,7 +3538,6 @@
             <w:r>
               <w:rPr>
                 <w:rFonts w:ascii="Consolas" w:hAnsi="Consolas"/>
-                <w:color w:val="C7254E"/>
               </w:rPr>
               <w:t>/reportes</w:t>
             </w:r>
@@ -3583,7 +3547,6 @@
             <w:r>
               <w:rPr>
                 <w:rFonts w:ascii="Consolas" w:hAnsi="Consolas"/>
-                <w:color w:val="C7254E"/>
               </w:rPr>
               <w:t>/reporte-horas</w:t>
             </w:r>
@@ -3593,7 +3556,6 @@
             <w:r>
               <w:rPr>
                 <w:rFonts w:ascii="Consolas" w:hAnsi="Consolas"/>
-                <w:color w:val="C7254E"/>
               </w:rPr>
               <w:t>/accesos-anfitrion</w:t>
             </w:r>
@@ -3643,7 +3605,6 @@
             <w:r>
               <w:rPr>
                 <w:rFonts w:ascii="Consolas" w:hAnsi="Consolas"/>
-                <w:color w:val="C7254E"/>
               </w:rPr>
               <w:t>/enviar-liga-registro</w:t>
             </w:r>
@@ -3693,7 +3654,6 @@
             <w:r>
               <w:rPr>
                 <w:rFonts w:ascii="Consolas" w:hAnsi="Consolas"/>
-                <w:color w:val="C7254E"/>
               </w:rPr>
               <w:t>/validar-token-registro</w:t>
             </w:r>
@@ -3703,7 +3663,6 @@
             <w:r>
               <w:rPr>
                 <w:rFonts w:ascii="Consolas" w:hAnsi="Consolas"/>
-                <w:color w:val="C7254E"/>
               </w:rPr>
               <w:t>/visitante</w:t>
             </w:r>
@@ -3753,7 +3712,6 @@
             <w:r>
               <w:rPr>
                 <w:rFonts w:ascii="Consolas" w:hAnsi="Consolas"/>
-                <w:color w:val="C7254E"/>
               </w:rPr>
               <w:t>/:id</w:t>
             </w:r>
@@ -3763,7 +3721,6 @@
             <w:r>
               <w:rPr>
                 <w:rFonts w:ascii="Consolas" w:hAnsi="Consolas"/>
-                <w:color w:val="C7254E"/>
               </w:rPr>
               <w:t>/modificar/:id</w:t>
             </w:r>
@@ -3773,7 +3730,6 @@
             <w:r>
               <w:rPr>
                 <w:rFonts w:ascii="Consolas" w:hAnsi="Consolas"/>
-                <w:color w:val="C7254E"/>
               </w:rPr>
               <w:t>/cancelar/:id</w:t>
             </w:r>
@@ -3783,7 +3739,6 @@
             <w:r>
               <w:rPr>
                 <w:rFonts w:ascii="Consolas" w:hAnsi="Consolas"/>
-                <w:color w:val="C7254E"/>
               </w:rPr>
               <w:t>/finalizar/:id</w:t>
             </w:r>
@@ -3833,7 +3788,6 @@
             <w:r>
               <w:rPr>
                 <w:rFonts w:ascii="Consolas" w:hAnsi="Consolas"/>
-                <w:color w:val="C7254E"/>
               </w:rPr>
               <w:t>/acceso/:id</w:t>
             </w:r>
@@ -3868,16 +3822,11 @@
       <w:pPr>
         <w:pStyle w:val="Heading2"/>
       </w:pPr>
-      <w:r/>
-      <w:r>
-        <w:t xml:space="preserve">9. Eventos — </w:t>
-      </w:r>
       <w:r>
         <w:rPr>
-          <w:rFonts w:ascii="Consolas" w:hAnsi="Consolas"/>
-          <w:color w:val="C7254E"/>
+          <w:color w:val="1F4E79"/>
         </w:rPr>
-        <w:t>/api/eventos</w:t>
+        <w:t>9. Eventos — `/api/eventos`</w:t>
       </w:r>
     </w:p>
     <w:tbl>
@@ -3901,11 +3850,13 @@
             <w:r>
               <w:rPr>
                 <w:b/>
+                <w:color w:val="1F4E79"/>
               </w:rPr>
             </w:r>
             <w:r>
               <w:rPr>
                 <w:b/>
+                <w:color w:val="1F4E79"/>
               </w:rPr>
               <w:t>Método</w:t>
             </w:r>
@@ -3919,11 +3870,13 @@
             <w:r>
               <w:rPr>
                 <w:b/>
+                <w:color w:val="1F4E79"/>
               </w:rPr>
             </w:r>
             <w:r>
               <w:rPr>
                 <w:b/>
+                <w:color w:val="1F4E79"/>
               </w:rPr>
               <w:t>Ruta</w:t>
             </w:r>
@@ -3937,11 +3890,13 @@
             <w:r>
               <w:rPr>
                 <w:b/>
+                <w:color w:val="1F4E79"/>
               </w:rPr>
             </w:r>
             <w:r>
               <w:rPr>
                 <w:b/>
+                <w:color w:val="1F4E79"/>
               </w:rPr>
               <w:t>Propósito</w:t>
             </w:r>
@@ -3955,11 +3910,13 @@
             <w:r>
               <w:rPr>
                 <w:b/>
+                <w:color w:val="1F4E79"/>
               </w:rPr>
             </w:r>
             <w:r>
               <w:rPr>
                 <w:b/>
+                <w:color w:val="1F4E79"/>
               </w:rPr>
               <w:t>Rol</w:t>
             </w:r>
@@ -3987,7 +3944,6 @@
             <w:r>
               <w:rPr>
                 <w:rFonts w:ascii="Consolas" w:hAnsi="Consolas"/>
-                <w:color w:val="C7254E"/>
               </w:rPr>
               <w:t>/form-reportes</w:t>
             </w:r>
@@ -3997,7 +3953,6 @@
             <w:r>
               <w:rPr>
                 <w:rFonts w:ascii="Consolas" w:hAnsi="Consolas"/>
-                <w:color w:val="C7254E"/>
               </w:rPr>
               <w:t>/kiosco/paneles</w:t>
             </w:r>
@@ -4007,7 +3962,6 @@
             <w:r>
               <w:rPr>
                 <w:rFonts w:ascii="Consolas" w:hAnsi="Consolas"/>
-                <w:color w:val="C7254E"/>
               </w:rPr>
               <w:t>/kiosco</w:t>
             </w:r>
@@ -4017,7 +3971,6 @@
             <w:r>
               <w:rPr>
                 <w:rFonts w:ascii="Consolas" w:hAnsi="Consolas"/>
-                <w:color w:val="C7254E"/>
               </w:rPr>
               <w:t>/imagen/:id</w:t>
             </w:r>
@@ -4027,7 +3980,6 @@
             <w:r>
               <w:rPr>
                 <w:rFonts w:ascii="Consolas" w:hAnsi="Consolas"/>
-                <w:color w:val="C7254E"/>
               </w:rPr>
               <w:t>/:id</w:t>
             </w:r>
@@ -4077,7 +4029,6 @@
             <w:r>
               <w:rPr>
                 <w:rFonts w:ascii="Consolas" w:hAnsi="Consolas"/>
-                <w:color w:val="C7254E"/>
               </w:rPr>
               <w:t>/form-reporte-horas</w:t>
             </w:r>
@@ -4127,7 +4078,6 @@
             <w:r>
               <w:rPr>
                 <w:rFonts w:ascii="Consolas" w:hAnsi="Consolas"/>
-                <w:color w:val="C7254E"/>
               </w:rPr>
               <w:t>/</w:t>
             </w:r>
@@ -4177,7 +4127,6 @@
             <w:r>
               <w:rPr>
                 <w:rFonts w:ascii="Consolas" w:hAnsi="Consolas"/>
-                <w:color w:val="C7254E"/>
               </w:rPr>
               <w:t>/validar-qr</w:t>
             </w:r>
@@ -4227,7 +4176,6 @@
             <w:r>
               <w:rPr>
                 <w:rFonts w:ascii="Consolas" w:hAnsi="Consolas"/>
-                <w:color w:val="C7254E"/>
               </w:rPr>
               <w:t>/autorizar</w:t>
             </w:r>
@@ -4237,7 +4185,6 @@
             <w:r>
               <w:rPr>
                 <w:rFonts w:ascii="Consolas" w:hAnsi="Consolas"/>
-                <w:color w:val="C7254E"/>
               </w:rPr>
               <w:t>/reporte-horas/individual/:id</w:t>
             </w:r>
@@ -4247,7 +4194,6 @@
             <w:r>
               <w:rPr>
                 <w:rFonts w:ascii="Consolas" w:hAnsi="Consolas"/>
-                <w:color w:val="C7254E"/>
               </w:rPr>
               <w:t>/reportes-horas</w:t>
             </w:r>
@@ -4297,7 +4243,6 @@
             <w:r>
               <w:rPr>
                 <w:rFonts w:ascii="Consolas" w:hAnsi="Consolas"/>
-                <w:color w:val="C7254E"/>
               </w:rPr>
               <w:t>/reportes</w:t>
             </w:r>
@@ -4329,24 +4274,22 @@
     </w:tbl>
     <w:p/>
     <w:p>
+      <w:pPr>
+        <w:ind w:left="360"/>
+      </w:pPr>
       <w:r>
-        <w:t>&gt; Endpoints de eventos vinculados a paneles/biometría/apertura de puertas se documentan en sus módulos de integración.</w:t>
+        <w:t>Endpoints de eventos vinculados a paneles/biometría/apertura de puertas se documentan en sus módulos de integración.</w:t>
       </w:r>
     </w:p>
     <w:p>
       <w:pPr>
         <w:pStyle w:val="Heading2"/>
       </w:pPr>
-      <w:r/>
-      <w:r>
-        <w:t xml:space="preserve">10. Configuración — </w:t>
-      </w:r>
       <w:r>
         <w:rPr>
-          <w:rFonts w:ascii="Consolas" w:hAnsi="Consolas"/>
-          <w:color w:val="C7254E"/>
+          <w:color w:val="1F4E79"/>
         </w:rPr>
-        <w:t>/api/configuracion</w:t>
+        <w:t>10. Configuración — `/api/configuracion`</w:t>
       </w:r>
     </w:p>
     <w:tbl>
@@ -4370,11 +4313,13 @@
             <w:r>
               <w:rPr>
                 <w:b/>
+                <w:color w:val="1F4E79"/>
               </w:rPr>
             </w:r>
             <w:r>
               <w:rPr>
                 <w:b/>
+                <w:color w:val="1F4E79"/>
               </w:rPr>
               <w:t>Método</w:t>
             </w:r>
@@ -4388,11 +4333,13 @@
             <w:r>
               <w:rPr>
                 <w:b/>
+                <w:color w:val="1F4E79"/>
               </w:rPr>
             </w:r>
             <w:r>
               <w:rPr>
                 <w:b/>
+                <w:color w:val="1F4E79"/>
               </w:rPr>
               <w:t>Ruta</w:t>
             </w:r>
@@ -4406,11 +4353,13 @@
             <w:r>
               <w:rPr>
                 <w:b/>
+                <w:color w:val="1F4E79"/>
               </w:rPr>
             </w:r>
             <w:r>
               <w:rPr>
                 <w:b/>
+                <w:color w:val="1F4E79"/>
               </w:rPr>
               <w:t>Propósito</w:t>
             </w:r>
@@ -4424,11 +4373,13 @@
             <w:r>
               <w:rPr>
                 <w:b/>
+                <w:color w:val="1F4E79"/>
               </w:rPr>
             </w:r>
             <w:r>
               <w:rPr>
                 <w:b/>
+                <w:color w:val="1F4E79"/>
               </w:rPr>
               <w:t>Rol</w:t>
             </w:r>
@@ -4456,7 +4407,6 @@
             <w:r>
               <w:rPr>
                 <w:rFonts w:ascii="Consolas" w:hAnsi="Consolas"/>
-                <w:color w:val="C7254E"/>
               </w:rPr>
               <w:t>/</w:t>
             </w:r>
@@ -4506,7 +4456,6 @@
             <w:r>
               <w:rPr>
                 <w:rFonts w:ascii="Consolas" w:hAnsi="Consolas"/>
-                <w:color w:val="C7254E"/>
               </w:rPr>
               <w:t>/integraciones</w:t>
             </w:r>
@@ -4556,7 +4505,6 @@
             <w:r>
               <w:rPr>
                 <w:rFonts w:ascii="Consolas" w:hAnsi="Consolas"/>
-                <w:color w:val="C7254E"/>
               </w:rPr>
               <w:t>/</w:t>
             </w:r>
@@ -4566,7 +4514,6 @@
             <w:r>
               <w:rPr>
                 <w:rFonts w:ascii="Consolas" w:hAnsi="Consolas"/>
-                <w:color w:val="C7254E"/>
               </w:rPr>
               <w:t>/integraciones</w:t>
             </w:r>
@@ -4576,7 +4523,6 @@
             <w:r>
               <w:rPr>
                 <w:rFonts w:ascii="Consolas" w:hAnsi="Consolas"/>
-                <w:color w:val="C7254E"/>
               </w:rPr>
               <w:t>/colecciones</w:t>
             </w:r>
@@ -4626,7 +4572,6 @@
             <w:r>
               <w:rPr>
                 <w:rFonts w:ascii="Consolas" w:hAnsi="Consolas"/>
-                <w:color w:val="C7254E"/>
               </w:rPr>
               <w:t>/roles/personalizado</w:t>
             </w:r>
@@ -4676,7 +4621,6 @@
             <w:r>
               <w:rPr>
                 <w:rFonts w:ascii="Consolas" w:hAnsi="Consolas"/>
-                <w:color w:val="C7254E"/>
               </w:rPr>
               <w:t>/roles/personalizado/:rol</w:t>
             </w:r>
@@ -4711,8 +4655,10 @@
       <w:pPr>
         <w:pStyle w:val="Heading2"/>
       </w:pPr>
-      <w:r/>
       <w:r>
+        <w:rPr>
+          <w:color w:val="1F4E79"/>
+        </w:rPr>
         <w:t>11. Catálogos base</w:t>
       </w:r>
     </w:p>
@@ -4723,7 +4669,6 @@
       <w:r>
         <w:rPr>
           <w:rFonts w:ascii="Consolas" w:hAnsi="Consolas"/>
-          <w:color w:val="C7254E"/>
         </w:rPr>
         <w:t>/api/accesos</w:t>
       </w:r>
@@ -4733,7 +4678,6 @@
       <w:r>
         <w:rPr>
           <w:rFonts w:ascii="Consolas" w:hAnsi="Consolas"/>
-          <w:color w:val="C7254E"/>
         </w:rPr>
         <w:t>/api/pisos</w:t>
       </w:r>
@@ -4743,7 +4687,6 @@
       <w:r>
         <w:rPr>
           <w:rFonts w:ascii="Consolas" w:hAnsi="Consolas"/>
-          <w:color w:val="C7254E"/>
         </w:rPr>
         <w:t>/api/puestos</w:t>
       </w:r>
@@ -4753,7 +4696,6 @@
       <w:r>
         <w:rPr>
           <w:rFonts w:ascii="Consolas" w:hAnsi="Consolas"/>
-          <w:color w:val="C7254E"/>
         </w:rPr>
         <w:t>/api/departamentos</w:t>
       </w:r>
@@ -4763,7 +4705,6 @@
       <w:r>
         <w:rPr>
           <w:rFonts w:ascii="Consolas" w:hAnsi="Consolas"/>
-          <w:color w:val="C7254E"/>
         </w:rPr>
         <w:t>/api/cubiculos</w:t>
       </w:r>
@@ -4773,7 +4714,6 @@
       <w:r>
         <w:rPr>
           <w:rFonts w:ascii="Consolas" w:hAnsi="Consolas"/>
-          <w:color w:val="C7254E"/>
         </w:rPr>
         <w:t>/api/empresas</w:t>
       </w:r>
@@ -4783,7 +4723,6 @@
       <w:r>
         <w:rPr>
           <w:rFonts w:ascii="Consolas" w:hAnsi="Consolas"/>
-          <w:color w:val="C7254E"/>
         </w:rPr>
         <w:t>/api/pases</w:t>
       </w:r>
@@ -4793,7 +4732,6 @@
       <w:r>
         <w:rPr>
           <w:rFonts w:ascii="Consolas" w:hAnsi="Consolas"/>
-          <w:color w:val="C7254E"/>
         </w:rPr>
         <w:t>/api/horarios</w:t>
       </w:r>
@@ -4821,11 +4759,13 @@
             <w:r>
               <w:rPr>
                 <w:b/>
+                <w:color w:val="1F4E79"/>
               </w:rPr>
             </w:r>
             <w:r>
               <w:rPr>
                 <w:b/>
+                <w:color w:val="1F4E79"/>
               </w:rPr>
               <w:t>Método</w:t>
             </w:r>
@@ -4839,11 +4779,13 @@
             <w:r>
               <w:rPr>
                 <w:b/>
+                <w:color w:val="1F4E79"/>
               </w:rPr>
             </w:r>
             <w:r>
               <w:rPr>
                 <w:b/>
+                <w:color w:val="1F4E79"/>
               </w:rPr>
               <w:t>Ruta tipo</w:t>
             </w:r>
@@ -4857,11 +4799,13 @@
             <w:r>
               <w:rPr>
                 <w:b/>
+                <w:color w:val="1F4E79"/>
               </w:rPr>
             </w:r>
             <w:r>
               <w:rPr>
                 <w:b/>
+                <w:color w:val="1F4E79"/>
               </w:rPr>
               <w:t>Propósito</w:t>
             </w:r>
@@ -4889,7 +4833,6 @@
             <w:r>
               <w:rPr>
                 <w:rFonts w:ascii="Consolas" w:hAnsi="Consolas"/>
-                <w:color w:val="C7254E"/>
               </w:rPr>
               <w:t>/&lt;catalogo&gt;</w:t>
             </w:r>
@@ -4899,7 +4842,6 @@
             <w:r>
               <w:rPr>
                 <w:rFonts w:ascii="Consolas" w:hAnsi="Consolas"/>
-                <w:color w:val="C7254E"/>
               </w:rPr>
               <w:t>/activos</w:t>
             </w:r>
@@ -4909,7 +4851,6 @@
             <w:r>
               <w:rPr>
                 <w:rFonts w:ascii="Consolas" w:hAnsi="Consolas"/>
-                <w:color w:val="C7254E"/>
               </w:rPr>
               <w:t>/:id</w:t>
             </w:r>
@@ -4948,7 +4889,6 @@
             <w:r>
               <w:rPr>
                 <w:rFonts w:ascii="Consolas" w:hAnsi="Consolas"/>
-                <w:color w:val="C7254E"/>
               </w:rPr>
               <w:t>/&lt;catalogo&gt;/form-nuevo</w:t>
             </w:r>
@@ -4958,7 +4898,6 @@
             <w:r>
               <w:rPr>
                 <w:rFonts w:ascii="Consolas" w:hAnsi="Consolas"/>
-                <w:color w:val="C7254E"/>
               </w:rPr>
               <w:t>/form-editar/:id</w:t>
             </w:r>
@@ -4997,7 +4936,6 @@
             <w:r>
               <w:rPr>
                 <w:rFonts w:ascii="Consolas" w:hAnsi="Consolas"/>
-                <w:color w:val="C7254E"/>
               </w:rPr>
               <w:t>/&lt;catalogo&gt;</w:t>
             </w:r>
@@ -5036,7 +4974,6 @@
             <w:r>
               <w:rPr>
                 <w:rFonts w:ascii="Consolas" w:hAnsi="Consolas"/>
-                <w:color w:val="C7254E"/>
               </w:rPr>
               <w:t>/&lt;catalogo&gt;/:id</w:t>
             </w:r>
@@ -5075,7 +5012,6 @@
             <w:r>
               <w:rPr>
                 <w:rFonts w:ascii="Consolas" w:hAnsi="Consolas"/>
-                <w:color w:val="C7254E"/>
               </w:rPr>
               <w:t>/&lt;catalogo&gt;/:id</w:t>
             </w:r>
@@ -5099,8 +5035,10 @@
       <w:pPr>
         <w:pStyle w:val="Heading2"/>
       </w:pPr>
-      <w:r/>
       <w:r>
+        <w:rPr>
+          <w:color w:val="1F4E79"/>
+        </w:rPr>
         <w:t>12. Tiempo real (WebSocket)</w:t>
       </w:r>
     </w:p>
@@ -5122,7 +5060,6 @@
       <w:r>
         <w:rPr>
           <w:rFonts w:ascii="Consolas" w:hAnsi="Consolas"/>
-          <w:color w:val="C7254E"/>
         </w:rPr>
         <w:t>validarTokenWS</w:t>
       </w:r>
@@ -5134,7 +5071,6 @@
       <w:r>
         <w:rPr>
           <w:rFonts w:ascii="Consolas" w:hAnsi="Consolas"/>
-          <w:color w:val="C7254E"/>
         </w:rPr>
         <w:t>[Foto: ejemplo de respuesta de /api/auth en Postman, con token enmascarado]</w:t>
       </w:r>
@@ -5143,8 +5079,10 @@
       <w:pPr>
         <w:pStyle w:val="Heading2"/>
       </w:pPr>
-      <w:r/>
       <w:r>
+        <w:rPr>
+          <w:color w:val="1F4E79"/>
+        </w:rPr>
         <w:t>13. Control documental</w:t>
       </w:r>
     </w:p>
@@ -5171,11 +5109,13 @@
             <w:r>
               <w:rPr>
                 <w:b/>
+                <w:color w:val="1F4E79"/>
               </w:rPr>
             </w:r>
             <w:r>
               <w:rPr>
                 <w:b/>
+                <w:color w:val="1F4E79"/>
               </w:rPr>
               <w:t>Documento</w:t>
             </w:r>
@@ -5189,11 +5129,13 @@
             <w:r>
               <w:rPr>
                 <w:b/>
+                <w:color w:val="1F4E79"/>
               </w:rPr>
             </w:r>
             <w:r>
               <w:rPr>
                 <w:b/>
+                <w:color w:val="1F4E79"/>
               </w:rPr>
               <w:t>Código</w:t>
             </w:r>
@@ -5207,11 +5149,13 @@
             <w:r>
               <w:rPr>
                 <w:b/>
+                <w:color w:val="1F4E79"/>
               </w:rPr>
             </w:r>
             <w:r>
               <w:rPr>
                 <w:b/>
+                <w:color w:val="1F4E79"/>
               </w:rPr>
               <w:t>Versión</w:t>
             </w:r>
@@ -5225,11 +5169,13 @@
             <w:r>
               <w:rPr>
                 <w:b/>
+                <w:color w:val="1F4E79"/>
               </w:rPr>
             </w:r>
             <w:r>
               <w:rPr>
                 <w:b/>
+                <w:color w:val="1F4E79"/>
               </w:rPr>
               <w:t>Fecha</w:t>
             </w:r>
@@ -5243,11 +5189,13 @@
             <w:r>
               <w:rPr>
                 <w:b/>
+                <w:color w:val="1F4E79"/>
               </w:rPr>
             </w:r>
             <w:r>
               <w:rPr>
                 <w:b/>
+                <w:color w:val="1F4E79"/>
               </w:rPr>
               <w:t>Responsable</w:t>
             </w:r>
@@ -5261,11 +5209,13 @@
             <w:r>
               <w:rPr>
                 <w:b/>
+                <w:color w:val="1F4E79"/>
               </w:rPr>
             </w:r>
             <w:r>
               <w:rPr>
                 <w:b/>
+                <w:color w:val="1F4E79"/>
               </w:rPr>
               <w:t>Estado</w:t>
             </w:r>

</xml_diff>